<commit_message>
Match AG News deliverables to reference style
</commit_message>
<xml_diff>
--- a/Term Project/deliverables/ag_news_final_report.docx
+++ b/Term Project/deliverables/ag_news_final_report.docx
@@ -21,7 +21,7 @@
         <w:pStyle w:val="Heading1"/>
       </w:pPr>
       <w:r>
-        <w:t>1. Introduction</w:t>
+        <w:t>Table of Figures</w:t>
       </w:r>
     </w:p>
     <w:p>
@@ -29,7 +29,7 @@
         <w:spacing w:after="100" w:line="259" w:lineRule="auto"/>
       </w:pPr>
       <w:r>
-        <w:t>This project compares two neural text classifiers trained from scratch on the AG News four-class classification task: a bidirectional LSTM classifier and a Transformer Encoder classifier. The goal is not simply to maximize accuracy. The project evaluates how recurrent sequence modeling and self-attention differ in classification performance, training behavior, convergence patterns, data efficiency, and failure cases.</w:t>
+        <w:t>Figure 1: Training and validation loss curves for the main comparison</w:t>
       </w:r>
     </w:p>
     <w:p>
@@ -37,7 +37,63 @@
         <w:spacing w:after="100" w:line="259" w:lineRule="auto"/>
       </w:pPr>
       <w:r>
-        <w:t>Both models use the same dataset source, split procedure, tokenizer, vocabulary, maximum sequence length, optimizer family, training budget, and evaluation metrics. This controlled setup makes the comparison more informative than a raw leaderboard-style accuracy result. The main research question is: under a shared preprocessing and training pipeline, how do the LSTM and Transformer Encoder differ on AG News classification?</w:t>
+        <w:t>Figure 2: LSTM final test confusion matrix</w:t>
+      </w:r>
+    </w:p>
+    <w:p>
+      <w:pPr>
+        <w:spacing w:after="100" w:line="259" w:lineRule="auto"/>
+      </w:pPr>
+      <w:r>
+        <w:t>Figure 3: Transformer Encoder final test confusion matrix</w:t>
+      </w:r>
+    </w:p>
+    <w:p>
+      <w:pPr>
+        <w:spacing w:after="100" w:line="259" w:lineRule="auto"/>
+      </w:pPr>
+      <w:r>
+        <w:t>Table 1: Trainable parameter counts</w:t>
+      </w:r>
+    </w:p>
+    <w:p>
+      <w:pPr>
+        <w:spacing w:after="100" w:line="259" w:lineRule="auto"/>
+      </w:pPr>
+      <w:r>
+        <w:t>Table 2: Final model configuration and hyperparameters</w:t>
+      </w:r>
+    </w:p>
+    <w:p>
+      <w:pPr>
+        <w:spacing w:after="100" w:line="259" w:lineRule="auto"/>
+      </w:pPr>
+      <w:r>
+        <w:t>Table 3: Main validation and test results</w:t>
+      </w:r>
+    </w:p>
+    <w:p>
+      <w:pPr>
+        <w:spacing w:after="100" w:line="259" w:lineRule="auto"/>
+      </w:pPr>
+      <w:r>
+        <w:t>Table 4: Dataset-size ablation results</w:t>
+      </w:r>
+    </w:p>
+    <w:p>
+      <w:pPr>
+        <w:spacing w:after="100" w:line="259" w:lineRule="auto"/>
+      </w:pPr>
+      <w:r>
+        <w:t>Table 5: Optional sequence-length ablation results</w:t>
+      </w:r>
+    </w:p>
+    <w:p>
+      <w:pPr>
+        <w:spacing w:after="100" w:line="259" w:lineRule="auto"/>
+      </w:pPr>
+      <w:r>
+        <w:t>Table 6: Selected misclassified examples</w:t>
       </w:r>
     </w:p>
     <w:p>
@@ -45,7 +101,7 @@
         <w:pStyle w:val="Heading1"/>
       </w:pPr>
       <w:r>
-        <w:t>2. Dataset And Preprocessing</w:t>
+        <w:t>Motivation</w:t>
       </w:r>
     </w:p>
     <w:p>
@@ -53,7 +109,7 @@
         <w:spacing w:after="100" w:line="259" w:lineRule="auto"/>
       </w:pPr>
       <w:r>
-        <w:t>The project uses Hugging Face `fancyzhx/ag_news` as the only dataset source. The official training split was divided into 108,000 training examples and 12,000 validation examples using `train_test_split(test_size=0.1, seed=42)`. The official test split contains 7,600 examples and was reserved for final evaluation only.</w:t>
+        <w:t>Text classification is one of the standard ways to evaluate whether a neural network can turn raw language into useful categories. In this report, I compare an LSTM classifier and a Transformer Encoder classifier on the same AG News task. The purpose is not only to see which model gives a slightly higher accuracy, but to evaluate how the two architectures behave when the dataset, preprocessing, training budget, and metrics are controlled.</w:t>
       </w:r>
     </w:p>
     <w:p>
@@ -61,7 +117,15 @@
         <w:spacing w:after="100" w:line="259" w:lineRule="auto"/>
       </w:pPr>
       <w:r>
-        <w:t>The four labels are `World`, `Sports`, `Business`, and `Sci/Tech`. The official test split is balanced, with 1,900 examples per class. The training split is also nearly balanced: 26,991 World, 26,966 Sports, 27,100 Business, and 26,943 Sci/Tech examples. Labels were verified as integer class indices `0, 1, 2, 3`, which matches the requirement for `torch.nn.CrossEntropyLoss`.</w:t>
+        <w:t>The comparison is interesting because the two models represent different assumptions about sequence data. The LSTM reads the text recurrently and carries information through a hidden state. The Transformer Encoder uses self-attention, allowing every token to interact with other tokens directly. In theory, the Transformer should have more flexible global context modeling, while the LSTM may be more stable when the amount of data is reduced.</w:t>
+      </w:r>
+    </w:p>
+    <w:p>
+      <w:pPr>
+        <w:pStyle w:val="Heading1"/>
+      </w:pPr>
+      <w:r>
+        <w:t>Background</w:t>
       </w:r>
     </w:p>
     <w:p>
@@ -69,7 +133,23 @@
         <w:spacing w:after="100" w:line="259" w:lineRule="auto"/>
       </w:pPr>
       <w:r>
-        <w:t>Texts were tokenized with a reproducible regular-expression tokenizer. The vocabulary was built only from the training split to avoid vocabulary leakage. The vocabulary size was capped at 20,000 tokens, with reserved indices for padding and unknown tokens. The main comparison used a maximum sequence length of 128 tokens. Both models received the same padded and truncated token IDs, and padding masks were used during LSTM pooling and Transformer attention.</w:t>
+        <w:t>AG News is a four-class news classification dataset. Each input is a short news text, and the model predicts one of four categories: `World`, `Sports`, `Business`, or `Sci/Tech`. The project uses Hugging Face `fancyzhx/ag_news` as the only dataset source. The official training split was divided into 108,000 training examples and 12,000 validation examples using `train_test_split(test_size=0.1, seed=42)`. The official test split contains 7,600 examples and was reserved for final evaluation only.</w:t>
+      </w:r>
+    </w:p>
+    <w:p>
+      <w:pPr>
+        <w:spacing w:after="100" w:line="259" w:lineRule="auto"/>
+      </w:pPr>
+      <w:r>
+        <w:t>The test split is balanced, with 1,900 examples per class. The training split is also nearly balanced: 26,991 World, 26,966 Sports, 27,100 Business, and 26,943 Sci/Tech examples. Labels were verified as integer class indices `0, 1, 2, 3`, which matches the requirement for `torch.nn.CrossEntropyLoss`.</w:t>
+      </w:r>
+    </w:p>
+    <w:p>
+      <w:pPr>
+        <w:spacing w:after="100" w:line="259" w:lineRule="auto"/>
+      </w:pPr>
+      <w:r>
+        <w:t>For preprocessing, the text was tokenized with a reproducible regular-expression tokenizer. The vocabulary was built only from the training split to avoid vocabulary leakage. The vocabulary size was capped at 20,000 tokens, with reserved indices for padding and unknown tokens. The main comparison used a maximum sequence length of 128 tokens. Both models received the same padded and truncated token IDs, and padding masks were used during LSTM pooling and Transformer attention.</w:t>
       </w:r>
     </w:p>
     <w:p>
@@ -77,7 +157,7 @@
         <w:pStyle w:val="Heading1"/>
       </w:pPr>
       <w:r>
-        <w:t>3. Models</w:t>
+        <w:t>Model Development</w:t>
       </w:r>
     </w:p>
     <w:p>
@@ -771,7 +851,7 @@
         <w:pStyle w:val="Heading1"/>
       </w:pPr>
       <w:r>
-        <w:t>4. Experiments</w:t>
+        <w:t>Experimental Verification</w:t>
       </w:r>
     </w:p>
     <w:p>
@@ -803,7 +883,7 @@
         <w:pStyle w:val="Heading1"/>
       </w:pPr>
       <w:r>
-        <w:t>5. Results</w:t>
+        <w:t>Results and Interpretation</w:t>
       </w:r>
     </w:p>
     <w:tbl>
@@ -1430,7 +1510,7 @@
         <w:pStyle w:val="Heading1"/>
       </w:pPr>
       <w:r>
-        <w:t>6. Ablation Study</w:t>
+        <w:t>Ablation Study</w:t>
       </w:r>
     </w:p>
     <w:p>
@@ -2427,7 +2507,7 @@
         <w:pStyle w:val="Heading1"/>
       </w:pPr>
       <w:r>
-        <w:t>7. Failure Analysis</w:t>
+        <w:t>Failure Analysis</w:t>
       </w:r>
     </w:p>
     <w:p>
@@ -3444,7 +3524,7 @@
         <w:pStyle w:val="Heading1"/>
       </w:pPr>
       <w:r>
-        <w:t>8. Conclusion</w:t>
+        <w:t>Conclusion</w:t>
       </w:r>
     </w:p>
     <w:p>
@@ -3461,6 +3541,46 @@
       </w:pPr>
       <w:r>
         <w:t>The required dataset-size ablation supports the original data-efficiency hypothesis. The optional sequence-length ablation showed that simply increasing maximum sequence length from 128 to 256 did not improve validation metrics. The most reasonable next experiment would be to tune early stopping or regularization, because both models show overfitting by the final epoch.</w:t>
+      </w:r>
+    </w:p>
+    <w:p>
+      <w:pPr>
+        <w:pStyle w:val="Heading1"/>
+      </w:pPr>
+      <w:r>
+        <w:t>Appendix</w:t>
+      </w:r>
+    </w:p>
+    <w:p>
+      <w:pPr>
+        <w:spacing w:after="100" w:line="259" w:lineRule="auto"/>
+      </w:pPr>
+      <w:r>
+        <w:t>The complete notebook and generated output files are included in the project repository. The AI Usage Appendix is provided as a separate required appendix and also included in the combined report deliverable.</w:t>
+      </w:r>
+    </w:p>
+    <w:p>
+      <w:pPr>
+        <w:pStyle w:val="Heading1"/>
+      </w:pPr>
+      <w:r>
+        <w:t>References</w:t>
+      </w:r>
+    </w:p>
+    <w:p>
+      <w:pPr>
+        <w:spacing w:after="100" w:line="259" w:lineRule="auto"/>
+      </w:pPr>
+      <w:r>
+        <w:t>AG News dataset via Hugging Face `fancyzhx/ag_news`.</w:t>
+      </w:r>
+    </w:p>
+    <w:p>
+      <w:pPr>
+        <w:spacing w:after="100" w:line="259" w:lineRule="auto"/>
+      </w:pPr>
+      <w:r>
+        <w:t>PyTorch documentation for recurrent layers, Transformer Encoder layers, and `torch.nn.CrossEntropyLoss`.</w:t>
       </w:r>
     </w:p>
     <w:sectPr>

</xml_diff>